<commit_message>
Revisión U06: numeración, tablas CE y correcciones técnicas
</commit_message>
<xml_diff>
--- a/docx/06-servicios-red/06-servicios-red.docx
+++ b/docx/06-servicios-red/06-servicios-red.docx
@@ -473,7 +473,7 @@
                 <w:rPr>
                   <w:rStyle w:val="Hyperlink"/>
                 </w:rPr>
-                <w:t xml:space="preserve">03 · DHCP en Cisco y helper</w:t>
+                <w:t xml:space="preserve">03 · DHCP en Cisco y el agente de reenvío</w:t>
               </w:r>
             </w:hyperlink>
           </w:p>
@@ -513,7 +513,7 @@
                 <w:rPr>
                   <w:rStyle w:val="Hyperlink"/>
                 </w:rPr>
-                <w:t xml:space="preserve">04 · DNS: la guía telefónica</w:t>
+                <w:t xml:space="preserve">04 · DNS: la guía telefónica de Internet</w:t>
               </w:r>
             </w:hyperlink>
           </w:p>
@@ -633,7 +633,7 @@
                 <w:rPr>
                   <w:rStyle w:val="Hyperlink"/>
                 </w:rPr>
-                <w:t xml:space="preserve">07 · NTP en Cisco</w:t>
+                <w:t xml:space="preserve">07 · NTP en Cisco: configuración y verificación</w:t>
               </w:r>
             </w:hyperlink>
           </w:p>
@@ -904,29 +904,29 @@
               <w:pStyle w:val="Compact"/>
             </w:pPr>
             <w:r>
-              <w:t xml:space="preserve">g)</w:t>
-            </w:r>
-          </w:p>
-        </w:tc>
-        <w:tc>
-          <w:tcPr/>
-          <w:p>
-            <w:pPr>
-              <w:pStyle w:val="Compact"/>
-            </w:pPr>
-            <w:r>
-              <w:t xml:space="preserve">Instalación de servidores DHCP/DNS</w:t>
-            </w:r>
-          </w:p>
-        </w:tc>
-        <w:tc>
-          <w:tcPr/>
-          <w:p>
-            <w:pPr>
-              <w:pStyle w:val="Compact"/>
-            </w:pPr>
-            <w:r>
-              <w:t xml:space="preserve">✅ Puntos 2, 3, 4 y 5 + ⚡ Laboratorio (punto 9)</w:t>
+              <w:t xml:space="preserve">d)</w:t>
+            </w:r>
+          </w:p>
+        </w:tc>
+        <w:tc>
+          <w:tcPr/>
+          <w:p>
+            <w:pPr>
+              <w:pStyle w:val="Compact"/>
+            </w:pPr>
+            <w:r>
+              <w:t xml:space="preserve">Direccionamiento lógico IP (automatizado)</w:t>
+            </w:r>
+          </w:p>
+        </w:tc>
+        <w:tc>
+          <w:tcPr/>
+          <w:p>
+            <w:pPr>
+              <w:pStyle w:val="Compact"/>
+            </w:pPr>
+            <w:r>
+              <w:t xml:space="preserve">✅ Puntos 2-3 + ⚡ Laboratorio (punto 9)</w:t>
             </w:r>
           </w:p>
         </w:tc>
@@ -939,29 +939,29 @@
               <w:pStyle w:val="Compact"/>
             </w:pPr>
             <w:r>
-              <w:t xml:space="preserve">h)</w:t>
-            </w:r>
-          </w:p>
-        </w:tc>
-        <w:tc>
-          <w:tcPr/>
-          <w:p>
-            <w:pPr>
-              <w:pStyle w:val="Compact"/>
-            </w:pPr>
-            <w:r>
-              <w:t xml:space="preserve">Resolución de nombres</w:t>
-            </w:r>
-          </w:p>
-        </w:tc>
-        <w:tc>
-          <w:tcPr/>
-          <w:p>
-            <w:pPr>
-              <w:pStyle w:val="Compact"/>
-            </w:pPr>
-            <w:r>
-              <w:t xml:space="preserve">✅ Puntos 4 y 5 + 🧠 Atrévete a pensar (punto 9)</w:t>
+              <w:t xml:space="preserve">g)</w:t>
+            </w:r>
+          </w:p>
+        </w:tc>
+        <w:tc>
+          <w:tcPr/>
+          <w:p>
+            <w:pPr>
+              <w:pStyle w:val="Compact"/>
+            </w:pPr>
+            <w:r>
+              <w:t xml:space="preserve">Servicios de configuración automática</w:t>
+            </w:r>
+          </w:p>
+        </w:tc>
+        <w:tc>
+          <w:tcPr/>
+          <w:p>
+            <w:pPr>
+              <w:pStyle w:val="Compact"/>
+            </w:pPr>
+            <w:r>
+              <w:t xml:space="preserve">✅ Puntos 2-3 + 🧠 Atrévete (punto 9)</w:t>
             </w:r>
           </w:p>
         </w:tc>
@@ -974,29 +974,29 @@
               <w:pStyle w:val="Compact"/>
             </w:pPr>
             <w:r>
-              <w:t xml:space="preserve">i)</w:t>
-            </w:r>
-          </w:p>
-        </w:tc>
-        <w:tc>
-          <w:tcPr/>
-          <w:p>
-            <w:pPr>
-              <w:pStyle w:val="Compact"/>
-            </w:pPr>
-            <w:r>
-              <w:t xml:space="preserve">Servicios de infraestructura</w:t>
-            </w:r>
-          </w:p>
-        </w:tc>
-        <w:tc>
-          <w:tcPr/>
-          <w:p>
-            <w:pPr>
-              <w:pStyle w:val="Compact"/>
-            </w:pPr>
-            <w:r>
-              <w:t xml:space="preserve">✅ Puntos 6 y 7 + 💬 Entrevista (punto 9)</w:t>
+              <w:t xml:space="preserve">h)</w:t>
+            </w:r>
+          </w:p>
+        </w:tc>
+        <w:tc>
+          <w:tcPr/>
+          <w:p>
+            <w:pPr>
+              <w:pStyle w:val="Compact"/>
+            </w:pPr>
+            <w:r>
+              <w:t xml:space="preserve">Servicios de resolución de nombres</w:t>
+            </w:r>
+          </w:p>
+        </w:tc>
+        <w:tc>
+          <w:tcPr/>
+          <w:p>
+            <w:pPr>
+              <w:pStyle w:val="Compact"/>
+            </w:pPr>
+            <w:r>
+              <w:t xml:space="preserve">✅ Puntos 4-5 + 💬 Entrevista (punto 9)</w:t>
             </w:r>
           </w:p>
         </w:tc>
@@ -1009,29 +1009,29 @@
               <w:pStyle w:val="Compact"/>
             </w:pPr>
             <w:r>
-              <w:t xml:space="preserve">d)</w:t>
-            </w:r>
-          </w:p>
-        </w:tc>
-        <w:tc>
-          <w:tcPr/>
-          <w:p>
-            <w:pPr>
-              <w:pStyle w:val="Compact"/>
-            </w:pPr>
-            <w:r>
-              <w:t xml:space="preserve">Direccionamiento lógico</w:t>
-            </w:r>
-          </w:p>
-        </w:tc>
-        <w:tc>
-          <w:tcPr/>
-          <w:p>
-            <w:pPr>
-              <w:pStyle w:val="Compact"/>
-            </w:pPr>
-            <w:r>
-              <w:t xml:space="preserve">✅ Puntos 2 y 3 (asignación automática)</w:t>
+              <w:t xml:space="preserve">i)</w:t>
+            </w:r>
+          </w:p>
+        </w:tc>
+        <w:tc>
+          <w:tcPr/>
+          <w:p>
+            <w:pPr>
+              <w:pStyle w:val="Compact"/>
+            </w:pPr>
+            <w:r>
+              <w:t xml:space="preserve">Servicios de infraestructura de red</w:t>
+            </w:r>
+          </w:p>
+        </w:tc>
+        <w:tc>
+          <w:tcPr/>
+          <w:p>
+            <w:pPr>
+              <w:pStyle w:val="Compact"/>
+            </w:pPr>
+            <w:r>
+              <w:t xml:space="preserve">✅ Puntos 6-7 + ⚡ Laboratorio (punto 9, NTP)</w:t>
             </w:r>
           </w:p>
         </w:tc>
@@ -1171,7 +1171,7 @@
         <w:pStyle w:val="Heading1"/>
       </w:pPr>
       <w:r>
-        <w:t xml:space="preserve">01 — Por qué necesitas servicios</w:t>
+        <w:t xml:space="preserve">1 — Por qué necesitas servicios</w:t>
       </w:r>
     </w:p>
     <w:p>
@@ -1219,7 +1219,7 @@
         <w:t xml:space="preserve"> </w:t>
       </w:r>
       <w:r>
-        <w:t xml:space="preserve">→ 01 · Por qué necesitas servicios</w:t>
+        <w:t xml:space="preserve">→ 1 · Por qué necesitas servicios</w:t>
       </w:r>
     </w:p>
     <w:p>
@@ -2576,7 +2576,7 @@
           <w:rPr>
             <w:rStyle w:val="Hyperlink"/>
           </w:rPr>
-          <w:t xml:space="preserve">02 · DHCP: el repartidor de IPs</w:t>
+          <w:t xml:space="preserve">2 · DHCP: el repartidor de IPs</w:t>
         </w:r>
       </w:hyperlink>
     </w:p>
@@ -2588,7 +2588,7 @@
         <w:pStyle w:val="Heading1"/>
       </w:pPr>
       <w:r>
-        <w:t xml:space="preserve">02 — DHCP: el repartidor de IPs</w:t>
+        <w:t xml:space="preserve">2 — DHCP: el repartidor de IPs</w:t>
       </w:r>
     </w:p>
     <w:p>
@@ -2636,7 +2636,7 @@
         <w:t xml:space="preserve"> </w:t>
       </w:r>
       <w:r>
-        <w:t xml:space="preserve">→ 02 · DHCP: el repartidor de IPs</w:t>
+        <w:t xml:space="preserve">→ 2 · DHCP: el repartidor de IPs</w:t>
       </w:r>
     </w:p>
     <w:p>
@@ -4434,7 +4434,7 @@
           <w:rPr>
             <w:rStyle w:val="Hyperlink"/>
           </w:rPr>
-          <w:t xml:space="preserve">01 · Por qué necesitas servicios</w:t>
+          <w:t xml:space="preserve">1 · Por qué necesitas servicios</w:t>
         </w:r>
       </w:hyperlink>
       <w:r>
@@ -4461,7 +4461,7 @@
           <w:rPr>
             <w:rStyle w:val="Hyperlink"/>
           </w:rPr>
-          <w:t xml:space="preserve">03 · DHCP en Cisco y el agente de reenvío</w:t>
+          <w:t xml:space="preserve">3 · DHCP en Cisco y el agente de reenvío</w:t>
         </w:r>
       </w:hyperlink>
     </w:p>
@@ -4473,7 +4473,7 @@
         <w:pStyle w:val="Heading1"/>
       </w:pPr>
       <w:r>
-        <w:t xml:space="preserve">03 — DHCP en Cisco y el agente de reenvío</w:t>
+        <w:t xml:space="preserve">3 — DHCP en Cisco y el agente de reenvío</w:t>
       </w:r>
     </w:p>
     <w:p>
@@ -4521,7 +4521,7 @@
         <w:t xml:space="preserve"> </w:t>
       </w:r>
       <w:r>
-        <w:t xml:space="preserve">→ 03 · DHCP en Cisco y el agente de reenvío</w:t>
+        <w:t xml:space="preserve">→ 3 · DHCP en Cisco y el agente de reenvío</w:t>
       </w:r>
     </w:p>
     <w:p>
@@ -5340,7 +5340,7 @@
         <w:t xml:space="preserve"> </w:t>
       </w:r>
       <w:r>
-        <w:t xml:space="preserve">reenvía por defecto otros broadcasts útiles (TFTP, DNS antiguo, NetBIOS, TFTP…). Si quieres afinar, existe</w:t>
+        <w:t xml:space="preserve">reenvía por defecto otros broadcasts útiles (TFTP, DNS, NetBIOS, syslog…). Si quieres afinar, existe</w:t>
       </w:r>
       <w:r>
         <w:t xml:space="preserve"> </w:t>
@@ -5593,7 +5593,7 @@
               <w:pStyle w:val="Compact"/>
             </w:pPr>
             <w:r>
-              <w:t xml:space="preserve">Uso de cada pool: direcciones ofrecidas, Solicitado, expiradas</w:t>
+              <w:t xml:space="preserve">Uso de cada pool: direcciones ofrecidas, solicitadas, expiradas</w:t>
             </w:r>
           </w:p>
         </w:tc>
@@ -6540,7 +6540,7 @@
           <w:rPr>
             <w:rStyle w:val="Hyperlink"/>
           </w:rPr>
-          <w:t xml:space="preserve">02 · DHCP: el repartidor de IPs</w:t>
+          <w:t xml:space="preserve">2 · DHCP: el repartidor de IPs</w:t>
         </w:r>
       </w:hyperlink>
       <w:r>
@@ -6567,7 +6567,7 @@
           <w:rPr>
             <w:rStyle w:val="Hyperlink"/>
           </w:rPr>
-          <w:t xml:space="preserve">04 · DNS: la guía telefónica de Internet</w:t>
+          <w:t xml:space="preserve">4 · DNS: la guía telefónica de Internet</w:t>
         </w:r>
       </w:hyperlink>
     </w:p>
@@ -6579,7 +6579,7 @@
         <w:pStyle w:val="Heading1"/>
       </w:pPr>
       <w:r>
-        <w:t xml:space="preserve">04 — DNS: la guía telefónica de Internet</w:t>
+        <w:t xml:space="preserve">4 — DNS: la guía telefónica de Internet</w:t>
       </w:r>
     </w:p>
     <w:p>
@@ -6627,7 +6627,7 @@
         <w:t xml:space="preserve"> </w:t>
       </w:r>
       <w:r>
-        <w:t xml:space="preserve">→ 04 · DNS: la guía telefónica de Internet</w:t>
+        <w:t xml:space="preserve">→ 4 · DNS: la guía telefónica de Internet</w:t>
       </w:r>
     </w:p>
     <w:p>
@@ -8548,7 +8548,7 @@
           <w:rPr>
             <w:rStyle w:val="Hyperlink"/>
           </w:rPr>
-          <w:t xml:space="preserve">03 · DHCP en Cisco y el agente de reenvío</w:t>
+          <w:t xml:space="preserve">3 · DHCP en Cisco y el agente de reenvío</w:t>
         </w:r>
       </w:hyperlink>
       <w:r>
@@ -8575,7 +8575,7 @@
           <w:rPr>
             <w:rStyle w:val="Hyperlink"/>
           </w:rPr>
-          <w:t xml:space="preserve">05 · Registros y zonas DNS</w:t>
+          <w:t xml:space="preserve">5 · Registros y zonas DNS</w:t>
         </w:r>
       </w:hyperlink>
     </w:p>
@@ -8587,7 +8587,7 @@
         <w:pStyle w:val="Heading1"/>
       </w:pPr>
       <w:r>
-        <w:t xml:space="preserve">05 — Registros y zonas DNS</w:t>
+        <w:t xml:space="preserve">5 — Registros y zonas DNS</w:t>
       </w:r>
     </w:p>
     <w:p>
@@ -8635,7 +8635,7 @@
         <w:t xml:space="preserve"> </w:t>
       </w:r>
       <w:r>
-        <w:t xml:space="preserve">→ 05 · Registros y zonas DNS</w:t>
+        <w:t xml:space="preserve">→ 5 · Registros y zonas DNS</w:t>
       </w:r>
     </w:p>
     <w:p>
@@ -9853,7 +9853,7 @@
           <w:rPr>
             <w:rStyle w:val="Hyperlink"/>
           </w:rPr>
-          <w:t xml:space="preserve">04 · DNS: la guía telefónica de Internet</w:t>
+          <w:t xml:space="preserve">4 · DNS: la guía telefónica de Internet</w:t>
         </w:r>
       </w:hyperlink>
       <w:r>
@@ -9880,7 +9880,7 @@
           <w:rPr>
             <w:rStyle w:val="Hyperlink"/>
           </w:rPr>
-          <w:t xml:space="preserve">06 · NTP: la hora es sagrada</w:t>
+          <w:t xml:space="preserve">6 · NTP: la hora es sagrada</w:t>
         </w:r>
       </w:hyperlink>
     </w:p>
@@ -9892,7 +9892,7 @@
         <w:pStyle w:val="Heading1"/>
       </w:pPr>
       <w:r>
-        <w:t xml:space="preserve">06 — NTP: la hora es sagrada</w:t>
+        <w:t xml:space="preserve">6 — NTP: la hora es sagrada</w:t>
       </w:r>
     </w:p>
     <w:p>
@@ -9940,7 +9940,7 @@
         <w:t xml:space="preserve"> </w:t>
       </w:r>
       <w:r>
-        <w:t xml:space="preserve">→ 06 · NTP: la hora es sagrada</w:t>
+        <w:t xml:space="preserve">→ 6 · NTP: la hora es sagrada</w:t>
       </w:r>
     </w:p>
     <w:p>
@@ -10613,7 +10613,7 @@
               <w:pStyle w:val="Compact"/>
             </w:pPr>
             <w:r>
-              <w:t xml:space="preserve">Round-robin de servidores volunteering en España</w:t>
+              <w:t xml:space="preserve">Round-robin de servidores voluntarios en España</w:t>
             </w:r>
           </w:p>
         </w:tc>
@@ -11245,7 +11245,7 @@
           <w:rPr>
             <w:rStyle w:val="Hyperlink"/>
           </w:rPr>
-          <w:t xml:space="preserve">05 · Registros y zonas DNS</w:t>
+          <w:t xml:space="preserve">5 · Registros y zonas DNS</w:t>
         </w:r>
       </w:hyperlink>
       <w:r>
@@ -11272,7 +11272,7 @@
           <w:rPr>
             <w:rStyle w:val="Hyperlink"/>
           </w:rPr>
-          <w:t xml:space="preserve">07 · NTP en Cisco: configuración y verificación</w:t>
+          <w:t xml:space="preserve">7 · NTP en Cisco: configuración y verificación</w:t>
         </w:r>
       </w:hyperlink>
     </w:p>
@@ -11284,7 +11284,7 @@
         <w:pStyle w:val="Heading1"/>
       </w:pPr>
       <w:r>
-        <w:t xml:space="preserve">07 — NTP en Cisco: configuración y verificación</w:t>
+        <w:t xml:space="preserve">7 — NTP en Cisco: configuración y verificación</w:t>
       </w:r>
     </w:p>
     <w:p>
@@ -11332,7 +11332,7 @@
         <w:t xml:space="preserve"> </w:t>
       </w:r>
       <w:r>
-        <w:t xml:space="preserve">→ 07 · NTP en Cisco: configuración y verificación</w:t>
+        <w:t xml:space="preserve">→ 7 · NTP en Cisco: configuración y verificación</w:t>
       </w:r>
     </w:p>
     <w:p>
@@ -12012,7 +12012,7 @@
         <w:rPr>
           <w:rStyle w:val="VerbatimChar"/>
         </w:rPr>
-        <w:t xml:space="preserve">Router-Core(config)# ntp authentication-key 1 md7 Cl4veNTP2026</w:t>
+        <w:t xml:space="preserve">Router-Core(config)# ntp authentication-key 1 md5 Cl4veNTP2026</w:t>
       </w:r>
       <w:r>
         <w:br/>
@@ -12058,7 +12058,7 @@
         <w:rPr>
           <w:rStyle w:val="VerbatimChar"/>
         </w:rPr>
-        <w:t xml:space="preserve">Switch(config)# ntp authentication-key 1 md7 Cl4veNTP2026</w:t>
+        <w:t xml:space="preserve">Switch(config)# ntp authentication-key 1 md5 Cl4veNTP2026</w:t>
       </w:r>
       <w:r>
         <w:br/>
@@ -12099,22 +12099,7 @@
         <w:t xml:space="preserve"> </w:t>
       </w:r>
       <w:r>
-        <w:t xml:space="preserve">(o</w:t>
-      </w:r>
-      <w:r>
-        <w:t xml:space="preserve"> </w:t>
-      </w:r>
-      <w:r>
-        <w:rPr>
-          <w:rStyle w:val="VerbatimChar"/>
-        </w:rPr>
-        <w:t xml:space="preserve">md7</w:t>
-      </w:r>
-      <w:r>
-        <w:t xml:space="preserve"> </w:t>
-      </w:r>
-      <w:r>
-        <w:t xml:space="preserve">en versiones modernas, que cifra la clave en la config) funciona entre routers y switches igual.</w:t>
+        <w:t xml:space="preserve">funciona entre routers y switches igual.</w:t>
       </w:r>
     </w:p>
     <w:p>
@@ -12339,7 +12324,7 @@
         <w:rPr>
           <w:rStyle w:val="VerbatimChar"/>
         </w:rPr>
-        <w:t xml:space="preserve">Clock is synchronized, stratum 3, reference is 10.0.0.1</w:t>
+        <w:t xml:space="preserve">Clock is synchronized, stratum 4, reference is 10.0.0.1</w:t>
       </w:r>
       <w:r>
         <w:br/>
@@ -12387,7 +12372,7 @@
         <w:rPr>
           <w:rStyle w:val="VerbatimChar"/>
         </w:rPr>
-        <w:t xml:space="preserve"> ~10.0.0.1        .INIT.          16      -     64     0  0.000   0.000  15937</w:t>
+        <w:t xml:space="preserve"> *10.0.0.1        127.127.1.0      3      18    128   377  2.150  -0.085   0.21</w:t>
       </w:r>
       <w:r>
         <w:br/>
@@ -12536,7 +12521,7 @@
         <w:t xml:space="preserve"> </w:t>
       </w:r>
       <w:r>
-        <w:t xml:space="preserve">— A ver, genio. ¿Y el reloj interno del router es un reloj de pulsera Suizo? No. Es un cristal barato que deriva. En dos semanas esos tres routers tienen tres horas distintas. Felicidades: tu red es ahora un testigo de la mancomunidad de horarios impossibles.</w:t>
+        <w:t xml:space="preserve">— A ver, genio. ¿Y el reloj interno del router es un reloj de pulsera Suizo? No. Es un cristal barato que deriva. En dos semanas esos tres routers tienen tres horas distintas. Felicidades: tu red es ahora una colección de relojes que no se ponen de acuerdo.</w:t>
       </w:r>
     </w:p>
     <w:p>
@@ -13413,7 +13398,7 @@
           <w:rPr>
             <w:rStyle w:val="Hyperlink"/>
           </w:rPr>
-          <w:t xml:space="preserve">06 · NTP: la hora es sagrada</w:t>
+          <w:t xml:space="preserve">6 · NTP: la hora es sagrada</w:t>
         </w:r>
       </w:hyperlink>
       <w:r>
@@ -13440,7 +13425,7 @@
           <w:rPr>
             <w:rStyle w:val="Hyperlink"/>
           </w:rPr>
-          <w:t xml:space="preserve">08 · Diagnóstico de servicios</w:t>
+          <w:t xml:space="preserve">8 · Diagnóstico de servicios</w:t>
         </w:r>
       </w:hyperlink>
     </w:p>
@@ -13452,7 +13437,7 @@
         <w:pStyle w:val="Heading1"/>
       </w:pPr>
       <w:r>
-        <w:t xml:space="preserve">08 — Diagnóstico de servicios</w:t>
+        <w:t xml:space="preserve">8 — Diagnóstico de servicios</w:t>
       </w:r>
     </w:p>
     <w:p>
@@ -13509,7 +13494,7 @@
         <w:t xml:space="preserve"> </w:t>
       </w:r>
       <w:r>
-        <w:t xml:space="preserve">→ 08 · Diagnóstico de servicios</w:t>
+        <w:t xml:space="preserve">→ 8 · Diagnóstico de servicios</w:t>
       </w:r>
     </w:p>
     <w:p>
@@ -15290,28 +15275,28 @@
         <w:rPr>
           <w:rStyle w:val="VerbatimChar"/>
         </w:rPr>
+        <w:t xml:space="preserve">w32tm /query /status</w:t>
+      </w:r>
+      <w:r>
+        <w:t xml:space="preserve"> </w:t>
+      </w:r>
+      <w:r>
+        <w:t xml:space="preserve">en Windows;</w:t>
+      </w:r>
+      <w:r>
+        <w:t xml:space="preserve"> </w:t>
+      </w:r>
+      <w:r>
+        <w:rPr>
+          <w:rStyle w:val="VerbatimChar"/>
+        </w:rPr>
         <w:t xml:space="preserve">show ntp status</w:t>
       </w:r>
       <w:r>
         <w:t xml:space="preserve"> </w:t>
       </w:r>
       <w:r>
-        <w:t xml:space="preserve">en servidores /</w:t>
-      </w:r>
-      <w:r>
-        <w:t xml:space="preserve"> </w:t>
-      </w:r>
-      <w:r>
-        <w:rPr>
-          <w:rStyle w:val="VerbatimChar"/>
-        </w:rPr>
-        <w:t xml:space="preserve">w32tm</w:t>
-      </w:r>
-      <w:r>
-        <w:t xml:space="preserve"> </w:t>
-      </w:r>
-      <w:r>
-        <w:t xml:space="preserve">en Windows). No se sube de escalón hasta que el actual falla o está verde.</w:t>
+        <w:t xml:space="preserve">en los equipos de red). No se sube de escalón hasta que el actual esté verde.</w:t>
       </w:r>
     </w:p>
     <w:p>
@@ -15756,7 +15741,7 @@
           <w:rPr>
             <w:rStyle w:val="Hyperlink"/>
           </w:rPr>
-          <w:t xml:space="preserve">07 · NTP en Cisco: configuración y verificación</w:t>
+          <w:t xml:space="preserve">7 · NTP en Cisco: configuración y verificación</w:t>
         </w:r>
       </w:hyperlink>
       <w:r>
@@ -15783,7 +15768,7 @@
           <w:rPr>
             <w:rStyle w:val="Hyperlink"/>
           </w:rPr>
-          <w:t xml:space="preserve">09 · Cierre</w:t>
+          <w:t xml:space="preserve">9 · Cierre</w:t>
         </w:r>
       </w:hyperlink>
     </w:p>
@@ -16019,22 +16004,7 @@
         <w:t xml:space="preserve"> </w:t>
       </w:r>
       <w:r>
-        <w:t xml:space="preserve">→ ✅ ¡Correcto! IP y nombres fluyen, pero la hora desajustada rompe la autenticación con el servidor. Toque final:</w:t>
-      </w:r>
-      <w:r>
-        <w:t xml:space="preserve"> </w:t>
-      </w:r>
-      <w:r>
-        <w:rPr>
-          <w:rStyle w:val="VerbatimChar"/>
-        </w:rPr>
-        <w:t xml:space="preserve">ntp server</w:t>
-      </w:r>
-      <w:r>
-        <w:t xml:space="preserve"> </w:t>
-      </w:r>
-      <w:r>
-        <w:t xml:space="preserve">en el portátil.</w:t>
+        <w:t xml:space="preserve">→ ✅ ¡Correcto! IP y nombres fluyen, pero la hora desajustada rompe la autenticación con el servidor. Toque final: pon el portátil en hora con el servidor NTP.</w:t>
       </w:r>
       <w:r>
         <w:t xml:space="preserve"> </w:t>
@@ -16744,7 +16714,7 @@
         <w:t xml:space="preserve"> </w:t>
       </w:r>
       <w:r>
-        <w:t xml:space="preserve">→ 192.168.1.200, y NTP activado como stratum 4.</w:t>
+        <w:t xml:space="preserve">→ 192.168.1.200, y NTP activado.</w:t>
       </w:r>
       <w:r>
         <w:t xml:space="preserve"> </w:t>
@@ -18126,7 +18096,7 @@
               <w:pStyle w:val="Compact"/>
             </w:pPr>
             <w:r>
-              <w:t xml:space="preserve">✅ Puntos 2-3 y ⚡ Laboratorio</w:t>
+              <w:t xml:space="preserve">✅ Puntos 2-3 + ⚡ Laboratorio (punto 9)</w:t>
             </w:r>
           </w:p>
         </w:tc>
@@ -18231,7 +18201,7 @@
               <w:pStyle w:val="Compact"/>
             </w:pPr>
             <w:r>
-              <w:t xml:space="preserve">✅ Puntos 6-7 + ⚡ Laboratorio (NTP)</w:t>
+              <w:t xml:space="preserve">✅ Puntos 6-7 + ⚡ Laboratorio (punto 9, NTP)</w:t>
             </w:r>
           </w:p>
         </w:tc>

</xml_diff>